<commit_message>
Sandy & Junior 2027: revisão da Parte 5
Co-Authored-By: Claude Opus 5.5 <noreply@anthropic.com>
Claude-Session: https://claude.ai/code/session_01MJjUEEZrxQDEUifKK2vj9g
</commit_message>
<xml_diff>
--- a/roteiros/sandy-junior-2027/SJ27_Parte5.docx
+++ b/roteiros/sandy-junior-2027/SJ27_Parte5.docx
@@ -111,7 +111,7 @@
         <w:rPr>
           <w:color w:val="C00000"/>
         </w:rPr>
-        <w:t>Só que, antes da estreia, uma das duas pessoas no centro daquela festa estava desmoronando em silêncio. E o que ela sentia naqueles dias tinha a ver com a imagem que o Brasil construiu para ela desde menina.</w:t>
+        <w:t>Só que, antes da estreia, uma das duas pessoas no centro daquela festa estava desmoronando em silêncio. E ela só revelaria isso anos depois, junto com um desabafo sobre a imagem que o Brasil construiu para ela desde menina.</w:t>
       </w:r>
     </w:p>
     <w:p>
@@ -183,7 +183,7 @@
         <w:rPr>
           <w:color w:val="C00000"/>
         </w:rPr>
-        <w:t>Lembra da música que fez dos dois estrelas? Lembra do final que eu prometi contar? Chegou a hora. Porque, num dos shows da turnê, Junior parou no meio dela. E o que ele disse ao público foi ovacionado.</w:t>
+        <w:t>Lembra da música que fez dos dois estrelas? Lembra do final que eu prometi contar? Chegou a hora. Porque, num dos shows da turnê, Junior parou antes do final dela. E o que ele disse ao público foi ovacionado.</w:t>
       </w:r>
     </w:p>
     <w:p>
@@ -311,7 +311,7 @@
         <w:rPr>
           <w:color w:val="000000"/>
         </w:rPr>
-        <w:t>O público aplaudiu.</w:t>
+        <w:t>O público ovacionou.</w:t>
       </w:r>
     </w:p>
     <w:p>

</xml_diff>